<commit_message>
Shorten and rewrite Abstract to cover both sine-wave and square-wave investigations
Co-authored-by: arena-agent <297053741+arena-agent@users.noreply.github.com>
</commit_message>
<xml_diff>
--- a/lab2_frequency_response/report/Lab_Report2.docx
+++ b/lab2_frequency_response/report/Lab_Report2.docx
@@ -1596,7 +1596,7 @@
           <w:color w:val="111111"/>
           <w:sz w:val="20"/>
         </w:rPr>
-        <w:t>Linear time-invariant (LTI) filters shape non-sinusoidal periodic signals by selectively scaling the amplitude and shifting the phase of each harmonic in the input signal’s Fourier series representation. Understanding how frequency-selective attenuation alters sharp time-domain transitions is essential for pulse-width-modulation (PWM) smoothing, digital-to-analogue reconstruction, and anti-aliasing signal conditioning. This report presents the square-wave investigation of Laboratory Experiment 2 on a passive first-order series resistor–capacitor (RC) circuit (</w:t>
+        <w:t>Frequency-selective filtering by linear time-invariant (LTI) systems is fundamental to analogue signal conditioning, anti-aliasing, and pulse-width-modulation (PWM) waveform smoothing. This study investigated the theoretical and experimental frequency response of a passive first-order series resistor–capacitor (RC) circuit (</w:t>
       </w:r>
       <w:r>
         <w:rPr>
@@ -1636,7 +1636,7 @@
           <w:color w:val="111111"/>
           <w:sz w:val="20"/>
         </w:rPr>
-        <w:t xml:space="preserve"> = 0.01 µF) with output voltage measured across the capacitor. The objectives were to derive the analytical frequency response </w:t>
+        <w:t xml:space="preserve"> = 0.01 µF) with output measured across the capacitor under both sinusoidal and periodic square-wave excitations. Differential-equation analysis yielded </w:t>
       </w:r>
       <w:r>
         <w:rPr>
@@ -1676,7 +1676,17 @@
           <w:color w:val="111111"/>
           <w:sz w:val="20"/>
         </w:rPr>
-        <w:t>ω), compute the theoretical harmonic response for the specified 15 V</w:t>
+        <w:t xml:space="preserve">ω) = 1 / (1 + </w:t>
+      </w:r>
+      <w:r>
+        <w:rPr>
+          <w:rFonts w:ascii="Calibri" w:hAnsi="Calibri"/>
+          <w:b w:val="0"/>
+          <w:i/>
+          <w:color w:val="111111"/>
+          <w:sz w:val="20"/>
+        </w:rPr>
+        <w:t>j</w:t>
       </w:r>
       <w:r>
         <w:rPr>
@@ -1685,8 +1695,69 @@
           <w:i w:val="0"/>
           <w:color w:val="111111"/>
           <w:sz w:val="20"/>
+        </w:rPr>
+        <w:t>ω</w:t>
+      </w:r>
+      <w:r>
+        <w:rPr>
+          <w:rFonts w:ascii="Calibri" w:hAnsi="Calibri"/>
+          <w:b w:val="0"/>
+          <w:i/>
+          <w:color w:val="111111"/>
+          <w:sz w:val="20"/>
+        </w:rPr>
+        <w:t>RC</w:t>
+      </w:r>
+      <w:r>
+        <w:rPr>
+          <w:rFonts w:ascii="Calibri" w:hAnsi="Calibri"/>
+          <w:b w:val="0"/>
+          <w:i w:val="0"/>
+          <w:color w:val="111111"/>
+          <w:sz w:val="20"/>
+        </w:rPr>
+        <w:t xml:space="preserve">), confirming a low-pass filter with time constant τ = 15 µs and −3 dB cut-off frequency </w:t>
+      </w:r>
+      <w:r>
+        <w:rPr>
+          <w:rFonts w:ascii="Calibri" w:hAnsi="Calibri"/>
+          <w:b w:val="0"/>
+          <w:i/>
+          <w:color w:val="111111"/>
+          <w:sz w:val="20"/>
+        </w:rPr>
+        <w:t>f</w:t>
+      </w:r>
+      <w:r>
+        <w:rPr>
+          <w:rFonts w:ascii="Calibri" w:hAnsi="Calibri"/>
+          <w:b w:val="0"/>
+          <w:i/>
+          <w:color w:val="111111"/>
+          <w:sz w:val="20"/>
           <w:vertAlign w:val="subscript"/>
         </w:rPr>
+        <w:t>c</w:t>
+      </w:r>
+      <w:r>
+        <w:rPr>
+          <w:rFonts w:ascii="Calibri" w:hAnsi="Calibri"/>
+          <w:b w:val="0"/>
+          <w:i w:val="0"/>
+          <w:color w:val="111111"/>
+          <w:sz w:val="20"/>
+        </w:rPr>
+        <w:t xml:space="preserve"> = 10.61 kHz, tested in the time and fast Fourier transform (FFT) domains on a Keysight DSOX4024G oscilloscope. Under 15 V</w:t>
+      </w:r>
+      <w:r>
+        <w:rPr>
+          <w:rFonts w:ascii="Calibri" w:hAnsi="Calibri"/>
+          <w:b w:val="0"/>
+          <w:i w:val="0"/>
+          <w:color w:val="111111"/>
+          <w:sz w:val="20"/>
+          <w:vertAlign w:val="subscript"/>
+        </w:rPr>
         <w:t>pp</w:t>
       </w:r>
       <w:r>
@@ -1697,14 +1768,8 @@
           <w:color w:val="111111"/>
           <w:sz w:val="20"/>
         </w:rPr>
-        <w:t>, 8 kHz, 50% duty-cycle square wave, evaluate predicted harmonic levels for the experimentally observed input voltage, and examine actual oscilloscope time-domain and fast Fourier transform (FFT) evidence.</w:t>
-      </w:r>
-    </w:p>
-    <w:p>
-      <w:pPr>
-        <w:spacing w:after="110"/>
-        <w:jc w:val="both"/>
-      </w:pPr>
+        <w:t xml:space="preserve"> sinusoidal inputs at 1, 10, and 40 kHz, measured outputs (15.20, 11.50, and 4.22 V</w:t>
+      </w:r>
       <w:r>
         <w:rPr>
           <w:rFonts w:ascii="Calibri" w:hAnsi="Calibri"/>
@@ -1712,18 +1777,9 @@
           <w:i w:val="0"/>
           <w:color w:val="111111"/>
           <w:sz w:val="20"/>
-        </w:rPr>
-        <w:t xml:space="preserve">From the circuit’s differential equation, complex exponential substitution yielded </w:t>
-      </w:r>
-      <w:r>
-        <w:rPr>
-          <w:rFonts w:ascii="Calibri" w:hAnsi="Calibri"/>
-          <w:b w:val="0"/>
-          <w:i/>
-          <w:color w:val="111111"/>
-          <w:sz w:val="20"/>
-        </w:rPr>
-        <w:t>H</w:t>
+          <w:vertAlign w:val="subscript"/>
+        </w:rPr>
+        <w:t>pp</w:t>
       </w:r>
       <w:r>
         <w:rPr>
@@ -1733,17 +1789,7 @@
           <w:color w:val="111111"/>
           <w:sz w:val="20"/>
         </w:rPr>
-        <w:t>(</w:t>
-      </w:r>
-      <w:r>
-        <w:rPr>
-          <w:rFonts w:ascii="Calibri" w:hAnsi="Calibri"/>
-          <w:b w:val="0"/>
-          <w:i/>
-          <w:color w:val="111111"/>
-          <w:sz w:val="20"/>
-        </w:rPr>
-        <w:t>j</w:t>
+        <w:t>; phase lags −6.65°, −42.30°, and −73.71°) and frequency-domain gains (−0.23, −2.81, and −11.35 dB) closely matched theoretical gains (−0.04, −2.76, and −11.82 dB). For an 8 kHz, 50% duty-cycle square wave, theoretical 15 V</w:t>
       </w:r>
       <w:r>
         <w:rPr>
@@ -1752,18 +1798,9 @@
           <w:i w:val="0"/>
           <w:color w:val="111111"/>
           <w:sz w:val="20"/>
-        </w:rPr>
-        <w:t xml:space="preserve">ω) = 1 / (1 + </w:t>
-      </w:r>
-      <w:r>
-        <w:rPr>
-          <w:rFonts w:ascii="Calibri" w:hAnsi="Calibri"/>
-          <w:b w:val="0"/>
-          <w:i/>
-          <w:color w:val="111111"/>
-          <w:sz w:val="20"/>
-        </w:rPr>
-        <w:t>j</w:t>
+          <w:vertAlign w:val="subscript"/>
+        </w:rPr>
+        <w:t>pp</w:t>
       </w:r>
       <w:r>
         <w:rPr>
@@ -1773,17 +1810,7 @@
           <w:color w:val="111111"/>
           <w:sz w:val="20"/>
         </w:rPr>
-        <w:t>ω</w:t>
-      </w:r>
-      <w:r>
-        <w:rPr>
-          <w:rFonts w:ascii="Calibri" w:hAnsi="Calibri"/>
-          <w:b w:val="0"/>
-          <w:i/>
-          <w:color w:val="111111"/>
-          <w:sz w:val="20"/>
-        </w:rPr>
-        <w:t>RC</w:t>
+        <w:t xml:space="preserve"> odd harmonics at 8, 24, and 40 kHz attenuated to 7.63, 1.29, and 0.49 V (−1.95, −7.87, and −11.82 dB). Experimentally, an observed 20.1 V</w:t>
       </w:r>
       <w:r>
         <w:rPr>
@@ -1792,29 +1819,9 @@
           <w:i w:val="0"/>
           <w:color w:val="111111"/>
           <w:sz w:val="20"/>
-        </w:rPr>
-        <w:t xml:space="preserve">), confirming a first-order low-pass filter with time constant τ = 15 µs and −3 dB cut-off frequency </w:t>
-      </w:r>
-      <w:r>
-        <w:rPr>
-          <w:rFonts w:ascii="Calibri" w:hAnsi="Calibri"/>
-          <w:b w:val="0"/>
-          <w:i/>
-          <w:color w:val="111111"/>
-          <w:sz w:val="20"/>
-        </w:rPr>
-        <w:t>f</w:t>
-      </w:r>
-      <w:r>
-        <w:rPr>
-          <w:rFonts w:ascii="Calibri" w:hAnsi="Calibri"/>
-          <w:b w:val="0"/>
-          <w:i/>
-          <w:color w:val="111111"/>
-          <w:sz w:val="20"/>
           <w:vertAlign w:val="subscript"/>
         </w:rPr>
-        <w:t>c</w:t>
+        <w:t>pp</w:t>
       </w:r>
       <w:r>
         <w:rPr>
@@ -1824,7 +1831,7 @@
           <w:color w:val="111111"/>
           <w:sz w:val="20"/>
         </w:rPr>
-        <w:t xml:space="preserve"> = 10.61 kHz. For the instructed 15 V</w:t>
+        <w:t xml:space="preserve"> input yielded a rounded 14.9 V</w:t>
       </w:r>
       <w:r>
         <w:rPr>
@@ -1845,107 +1852,7 @@
           <w:color w:val="111111"/>
           <w:sz w:val="20"/>
         </w:rPr>
-        <w:t xml:space="preserve"> square wave, theoretical odd Fourier coefficients at 8, 24, and 40 kHz were 9.55, 3.18, and 1.91 V (19.60, 10.06, and 5.62 dBV, peak convention), which the RC filter attenuated to 7.63, 1.29, and 0.49 V (17.65, 2.19, and −6.19 dBV), corresponding to theoretical gains of −1.95, −7.87, and −11.82 dB.</w:t>
-      </w:r>
-    </w:p>
-    <w:p>
-      <w:pPr>
-        <w:spacing w:after="110"/>
-        <w:jc w:val="both"/>
-      </w:pPr>
-      <w:r>
-        <w:rPr>
-          <w:rFonts w:ascii="Calibri" w:hAnsi="Calibri"/>
-          <w:b w:val="0"/>
-          <w:i w:val="0"/>
-          <w:color w:val="111111"/>
-          <w:sz w:val="20"/>
-        </w:rPr>
-        <w:t>On the Keysight DSOX4024G oscilloscope, the actual square-wave excitation measured 20.1 V</w:t>
-      </w:r>
-      <w:r>
-        <w:rPr>
-          <w:rFonts w:ascii="Calibri" w:hAnsi="Calibri"/>
-          <w:b w:val="0"/>
-          <w:i w:val="0"/>
-          <w:color w:val="111111"/>
-          <w:sz w:val="20"/>
-          <w:vertAlign w:val="subscript"/>
-        </w:rPr>
-        <w:t>pp</w:t>
-      </w:r>
-      <w:r>
-        <w:rPr>
-          <w:rFonts w:ascii="Calibri" w:hAnsi="Calibri"/>
-          <w:b w:val="0"/>
-          <w:i w:val="0"/>
-          <w:color w:val="111111"/>
-          <w:sz w:val="20"/>
-        </w:rPr>
-        <w:t xml:space="preserve"> on Channel 1 at 8.00 kHz—exceeding the nominal 15 V</w:t>
-      </w:r>
-      <w:r>
-        <w:rPr>
-          <w:rFonts w:ascii="Calibri" w:hAnsi="Calibri"/>
-          <w:b w:val="0"/>
-          <w:i w:val="0"/>
-          <w:color w:val="111111"/>
-          <w:sz w:val="20"/>
-          <w:vertAlign w:val="subscript"/>
-        </w:rPr>
-        <w:t>pp</w:t>
-      </w:r>
-      <w:r>
-        <w:rPr>
-          <w:rFonts w:ascii="Calibri" w:hAnsi="Calibri"/>
-          <w:b w:val="0"/>
-          <w:i w:val="0"/>
-          <w:color w:val="111111"/>
-          <w:sz w:val="20"/>
-        </w:rPr>
-        <w:t xml:space="preserve"> setting—and produced a smoothed, rounded exponential output of 14.9 V</w:t>
-      </w:r>
-      <w:r>
-        <w:rPr>
-          <w:rFonts w:ascii="Calibri" w:hAnsi="Calibri"/>
-          <w:b w:val="0"/>
-          <w:i w:val="0"/>
-          <w:color w:val="111111"/>
-          <w:sz w:val="20"/>
-          <w:vertAlign w:val="subscript"/>
-        </w:rPr>
-        <w:t>pp</w:t>
-      </w:r>
-      <w:r>
-        <w:rPr>
-          <w:rFonts w:ascii="Calibri" w:hAnsi="Calibri"/>
-          <w:b w:val="0"/>
-          <w:i w:val="0"/>
-          <w:color w:val="111111"/>
-          <w:sz w:val="20"/>
-        </w:rPr>
-        <w:t xml:space="preserve"> on Channel 2. Because the saved oscilloscope FFT screenshots primarily displayed FFT(CH2) with uncoupled cursor placements that did not confirm paired input–output peak amplitudes, Table C harmonic levels were calculated as predicted values scaled to the observed 20.1 V</w:t>
-      </w:r>
-      <w:r>
-        <w:rPr>
-          <w:rFonts w:ascii="Calibri" w:hAnsi="Calibri"/>
-          <w:b w:val="0"/>
-          <w:i w:val="0"/>
-          <w:color w:val="111111"/>
-          <w:sz w:val="20"/>
-          <w:vertAlign w:val="subscript"/>
-        </w:rPr>
-        <w:t>pp</w:t>
-      </w:r>
-      <w:r>
-        <w:rPr>
-          <w:rFonts w:ascii="Calibri" w:hAnsi="Calibri"/>
-          <w:b w:val="0"/>
-          <w:i w:val="0"/>
-          <w:color w:val="111111"/>
-          <w:sz w:val="20"/>
-        </w:rPr>
-        <w:t xml:space="preserve"> input (22.14, 12.60, and 8.17 dBV input; 20.19, 4.72, and −3.65 dBV output), while waveform captures confirmed progressive suppression of higher harmonics.</w:t>
+        <w:t xml:space="preserve"> exponential output, while predicted Table C harmonic outputs (20.19, 4.72, and −3.65 dBV) supplemented unconfirmed FFT cursor peaks, validating LTI filtering and Fourier superposition principles.</w:t>
       </w:r>
     </w:p>
     <w:p>

</xml_diff>